<commit_message>
sync readme with the final gm-api module description
</commit_message>
<xml_diff>
--- a/README.docx
+++ b/README.docx
@@ -228,7 +228,7 @@
       <w:pPr>
         <w:numPr>
           <w:ilvl w:val="0"/>
-          <w:numId w:val="5"/>
+          <w:numId w:val="6"/>
         </w:numPr>
         <w:spacing w:after="0" w:afterAutospacing="0" w:lineRule="auto"/>
         <w:ind w:left="720" w:hanging="360"/>
@@ -258,7 +258,7 @@
       <w:pPr>
         <w:numPr>
           <w:ilvl w:val="0"/>
-          <w:numId w:val="5"/>
+          <w:numId w:val="6"/>
         </w:numPr>
         <w:spacing w:after="0" w:afterAutospacing="0" w:lineRule="auto"/>
         <w:ind w:left="720" w:hanging="360"/>
@@ -301,7 +301,7 @@
       <w:pPr>
         <w:numPr>
           <w:ilvl w:val="0"/>
-          <w:numId w:val="5"/>
+          <w:numId w:val="6"/>
         </w:numPr>
         <w:spacing w:after="0" w:afterAutospacing="0" w:lineRule="auto"/>
         <w:ind w:left="720" w:hanging="360"/>
@@ -318,7 +318,7 @@
       <w:pPr>
         <w:numPr>
           <w:ilvl w:val="0"/>
-          <w:numId w:val="5"/>
+          <w:numId w:val="6"/>
         </w:numPr>
         <w:spacing w:after="0" w:afterAutospacing="0" w:lineRule="auto"/>
         <w:ind w:left="720" w:hanging="360"/>
@@ -349,7 +349,7 @@
       <w:pPr>
         <w:numPr>
           <w:ilvl w:val="0"/>
-          <w:numId w:val="5"/>
+          <w:numId w:val="6"/>
         </w:numPr>
         <w:spacing w:after="0" w:afterAutospacing="0" w:lineRule="auto"/>
         <w:ind w:left="720" w:hanging="360"/>
@@ -413,7 +413,7 @@
       <w:pPr>
         <w:numPr>
           <w:ilvl w:val="0"/>
-          <w:numId w:val="5"/>
+          <w:numId w:val="6"/>
         </w:numPr>
         <w:spacing w:after="240" w:lineRule="auto"/>
         <w:ind w:left="720" w:hanging="360"/>
@@ -475,37 +475,63 @@
     </w:p>
     <w:p>
       <w:pPr>
+        <w:spacing w:after="40" w:before="20" w:lineRule="auto"/>
         <w:rPr/>
       </w:pPr>
       <w:r>
         <w:rPr>
           <w:rtl w:val="0"/>
         </w:rPr>
-        <w:t xml:space="preserve">Three Maven modules:</w:t>
-      </w:r>
-    </w:p>
-    <w:p>
-      <w:pPr>
-        <w:rPr/>
-      </w:pPr>
-      <w:r>
-        <w:rPr>
-          <w:rtl w:val="0"/>
-        </w:rPr>
-      </w:r>
-    </w:p>
-    <w:p>
-      <w:pPr>
-        <w:numPr>
-          <w:ilvl w:val="0"/>
-          <w:numId w:val="7"/>
-        </w:numPr>
-        <w:spacing w:after="0" w:afterAutospacing="0" w:lineRule="auto"/>
-        <w:ind w:left="720" w:hanging="360"/>
-      </w:pPr>
-      <w:r>
-        <w:rPr>
-          <w:color w:val="188038"/>
+        <w:t xml:space="preserve">Four Maven modules:</w:t>
+      </w:r>
+    </w:p>
+    <w:p>
+      <w:pPr>
+        <w:numPr>
+          <w:ilvl w:val="0"/>
+          <w:numId w:val="5"/>
+        </w:numPr>
+        <w:spacing w:after="0" w:afterAutospacing="0" w:before="200" w:lineRule="auto"/>
+        <w:ind w:left="720" w:hanging="360"/>
+        <w:rPr>
+          <w:color w:val="000000"/>
+          <w:sz w:val="22"/>
+          <w:szCs w:val="22"/>
+        </w:rPr>
+      </w:pPr>
+      <w:r>
+        <w:rPr>
+          <w:b w:val="1"/>
+          <w:bCs w:val="1"/>
+          <w:rtl w:val="0"/>
+        </w:rPr>
+        <w:t xml:space="preserve">gm-api</w:t>
+      </w:r>
+      <w:r>
+        <w:rPr>
+          <w:rtl w:val="0"/>
+        </w:rPr>
+        <w:t xml:space="preserve"> - the client-server contract: the GmEngine interface, every DTO, the exceptions, and the two enums that appear directly in DTO fields (OrderSide, EventStatus). No trading logic, no XML, no JavaFX.</w:t>
+      </w:r>
+    </w:p>
+    <w:p>
+      <w:pPr>
+        <w:numPr>
+          <w:ilvl w:val="0"/>
+          <w:numId w:val="5"/>
+        </w:numPr>
+        <w:spacing w:after="0" w:afterAutospacing="0" w:before="0" w:beforeAutospacing="0" w:lineRule="auto"/>
+        <w:ind w:left="720" w:hanging="360"/>
+        <w:rPr>
+          <w:color w:val="000000"/>
+          <w:sz w:val="22"/>
+          <w:szCs w:val="22"/>
+        </w:rPr>
+      </w:pPr>
+      <w:r>
+        <w:rPr>
+          <w:b w:val="1"/>
+          <w:bCs w:val="1"/>
           <w:rtl w:val="0"/>
         </w:rPr>
         <w:t xml:space="preserve">gm-engine</w:t>
@@ -514,35 +540,27 @@
         <w:rPr>
           <w:rtl w:val="0"/>
         </w:rPr>
-        <w:t xml:space="preserve"> – the passive engine, still unaware of who’s calling it (console in Exercise 1, JavaFX in Exercise 2, now a servlet layer). Loads/validates the Exercise 3 XML, tracks users created purely through login, runs both trading methods, and exposes everything through </w:t>
-      </w:r>
-      <w:r>
-        <w:rPr>
-          <w:color w:val="188038"/>
-          <w:rtl w:val="0"/>
-        </w:rPr>
-        <w:t xml:space="preserve">GmEngine</w:t>
-      </w:r>
-      <w:r>
-        <w:rPr>
-          <w:rtl w:val="0"/>
-        </w:rPr>
-        <w:t xml:space="preserve"> using immutable DTOs.</w:t>
-        <w:br w:type="textWrapping"/>
-      </w:r>
-    </w:p>
-    <w:p>
-      <w:pPr>
-        <w:numPr>
-          <w:ilvl w:val="0"/>
-          <w:numId w:val="7"/>
-        </w:numPr>
-        <w:spacing w:after="0" w:afterAutospacing="0" w:lineRule="auto"/>
-        <w:ind w:left="720" w:hanging="360"/>
-      </w:pPr>
-      <w:r>
-        <w:rPr>
-          <w:color w:val="188038"/>
+        <w:t xml:space="preserve"> - the passive engine, still unaware of who's calling it (console in Exercise 1, JavaFX in Exercise 2, now a servlet layer). Depends on gm-api, implements GmEngine, loads/validates the Exercise 3 XML, tracks users created purely through login, and runs both trading methods.</w:t>
+      </w:r>
+    </w:p>
+    <w:p>
+      <w:pPr>
+        <w:numPr>
+          <w:ilvl w:val="0"/>
+          <w:numId w:val="5"/>
+        </w:numPr>
+        <w:spacing w:after="0" w:afterAutospacing="0" w:before="0" w:beforeAutospacing="0" w:lineRule="auto"/>
+        <w:ind w:left="720" w:hanging="360"/>
+        <w:rPr>
+          <w:color w:val="000000"/>
+          <w:sz w:val="22"/>
+          <w:szCs w:val="22"/>
+        </w:rPr>
+      </w:pPr>
+      <w:r>
+        <w:rPr>
+          <w:b w:val="1"/>
+          <w:bCs w:val="1"/>
           <w:rtl w:val="0"/>
         </w:rPr>
         <w:t xml:space="preserve">gm-server</w:t>
@@ -551,48 +569,27 @@
         <w:rPr>
           <w:rtl w:val="0"/>
         </w:rPr>
-        <w:t xml:space="preserve"> – a WAR of plain </w:t>
-      </w:r>
-      <w:r>
-        <w:rPr>
-          <w:color w:val="188038"/>
-          <w:rtl w:val="0"/>
-        </w:rPr>
-        <w:t xml:space="preserve">jakarta.servlet</w:t>
-      </w:r>
-      <w:r>
-        <w:rPr>
-          <w:rtl w:val="0"/>
-        </w:rPr>
-        <w:t xml:space="preserve"> classes wrapping one shared </w:t>
-      </w:r>
-      <w:r>
-        <w:rPr>
-          <w:color w:val="188038"/>
-          <w:rtl w:val="0"/>
-        </w:rPr>
-        <w:t xml:space="preserve">GmEngine</w:t>
-      </w:r>
-      <w:r>
-        <w:rPr>
-          <w:rtl w:val="0"/>
-        </w:rPr>
-        <w:t xml:space="preserve"> instance and translating HTTP/JSON to/from its calls. No web framework, per the course’s scope.</w:t>
-        <w:br w:type="textWrapping"/>
-      </w:r>
-    </w:p>
-    <w:p>
-      <w:pPr>
-        <w:numPr>
-          <w:ilvl w:val="0"/>
-          <w:numId w:val="7"/>
-        </w:numPr>
-        <w:spacing w:after="240" w:lineRule="auto"/>
-        <w:ind w:left="720" w:hanging="360"/>
-      </w:pPr>
-      <w:r>
-        <w:rPr>
-          <w:color w:val="188038"/>
+        <w:t xml:space="preserve"> - a WAR of plain jakarta.servlet classes wrapping one shared GmEngine instance and translating HTTP/JSON to/from its calls. No web framework, per the course's scope.</w:t>
+      </w:r>
+    </w:p>
+    <w:p>
+      <w:pPr>
+        <w:numPr>
+          <w:ilvl w:val="0"/>
+          <w:numId w:val="5"/>
+        </w:numPr>
+        <w:spacing w:after="200" w:before="0" w:beforeAutospacing="0" w:lineRule="auto"/>
+        <w:ind w:left="720" w:hanging="360"/>
+        <w:rPr>
+          <w:color w:val="000000"/>
+          <w:sz w:val="22"/>
+          <w:szCs w:val="22"/>
+        </w:rPr>
+      </w:pPr>
+      <w:r>
+        <w:rPr>
+          <w:b w:val="1"/>
+          <w:bCs w:val="1"/>
           <w:rtl w:val="0"/>
         </w:rPr>
         <w:t xml:space="preserve">gm-client</w:t>
@@ -601,33 +598,12 @@
         <w:rPr>
           <w:rtl w:val="0"/>
         </w:rPr>
-        <w:t xml:space="preserve"> – Exercise 2’s JavaFX UI, reused directly. The only structural change is what feeds it data: a new </w:t>
-      </w:r>
-      <w:r>
-        <w:rPr>
-          <w:color w:val="188038"/>
-          <w:rtl w:val="0"/>
-        </w:rPr>
-        <w:t xml:space="preserve">GmHttpEngine</w:t>
-      </w:r>
-      <w:r>
-        <w:rPr>
-          <w:rtl w:val="0"/>
-        </w:rPr>
-        <w:t xml:space="preserve"> implements the same </w:t>
-      </w:r>
-      <w:r>
-        <w:rPr>
-          <w:color w:val="188038"/>
-          <w:rtl w:val="0"/>
-        </w:rPr>
-        <w:t xml:space="preserve">GmEngine</w:t>
-      </w:r>
-      <w:r>
-        <w:rPr>
-          <w:rtl w:val="0"/>
-        </w:rPr>
-        <w:t xml:space="preserve"> interface over HTTP instead of touching engine objects directly, so almost every existing screen kept working with no logic changes.</w:t>
+        <w:t xml:space="preserve"> - Exercise 2's JavaFX UI, reused directly, depending only on gm-api. The only structural change is what feeds it data: a new GmHttpEngine implements the same GmEngine interface over HTTP instead of touching engine objects directly.</w:t>
+      </w:r>
+      <w:r>
+        <w:rPr>
+          <w:rtl w:val="0"/>
+        </w:rPr>
         <w:br w:type="textWrapping"/>
       </w:r>
     </w:p>
@@ -903,7 +879,7 @@
       <w:pPr>
         <w:numPr>
           <w:ilvl w:val="0"/>
-          <w:numId w:val="6"/>
+          <w:numId w:val="7"/>
         </w:numPr>
         <w:spacing w:after="0" w:afterAutospacing="0" w:lineRule="auto"/>
         <w:ind w:left="720" w:hanging="360"/>
@@ -932,7 +908,7 @@
         <w:rPr>
           <w:rtl w:val="0"/>
         </w:rPr>
-        <w:t xml:space="preserve"> – gained </w:t>
+        <w:t xml:space="preserve"> - gained </w:t>
       </w:r>
       <w:r>
         <w:rPr>
@@ -1031,7 +1007,7 @@
       <w:pPr>
         <w:numPr>
           <w:ilvl w:val="0"/>
-          <w:numId w:val="6"/>
+          <w:numId w:val="7"/>
         </w:numPr>
         <w:spacing w:after="0" w:afterAutospacing="0" w:lineRule="auto"/>
         <w:ind w:left="720" w:hanging="360"/>
@@ -1094,7 +1070,7 @@
       <w:pPr>
         <w:numPr>
           <w:ilvl w:val="0"/>
-          <w:numId w:val="6"/>
+          <w:numId w:val="7"/>
         </w:numPr>
         <w:spacing w:after="0" w:afterAutospacing="0" w:lineRule="auto"/>
         <w:ind w:left="720" w:hanging="360"/>
@@ -1110,7 +1086,7 @@
         <w:rPr>
           <w:rtl w:val="0"/>
         </w:rPr>
-        <w:t xml:space="preserve"> – new, the chat message shape. </w:t>
+        <w:t xml:space="preserve"> - new, the chat message shape. </w:t>
       </w:r>
       <w:r>
         <w:rPr>
@@ -1183,7 +1159,7 @@
       <w:pPr>
         <w:numPr>
           <w:ilvl w:val="0"/>
-          <w:numId w:val="6"/>
+          <w:numId w:val="7"/>
         </w:numPr>
         <w:spacing w:after="0" w:afterAutospacing="0" w:lineRule="auto"/>
         <w:ind w:left="720" w:hanging="360"/>
@@ -1199,7 +1175,7 @@
         <w:rPr>
           <w:rtl w:val="0"/>
         </w:rPr>
-        <w:t xml:space="preserve"> (whole module is new) – </w:t>
+        <w:t xml:space="preserve"> (whole module is new) - </w:t>
       </w:r>
       <w:r>
         <w:rPr>
@@ -1350,7 +1326,7 @@
       <w:pPr>
         <w:numPr>
           <w:ilvl w:val="0"/>
-          <w:numId w:val="6"/>
+          <w:numId w:val="7"/>
         </w:numPr>
         <w:spacing w:after="0" w:afterAutospacing="0" w:lineRule="auto"/>
         <w:ind w:left="720" w:hanging="360"/>
@@ -1366,7 +1342,7 @@
         <w:rPr>
           <w:rtl w:val="0"/>
         </w:rPr>
-        <w:t xml:space="preserve"> – implements </w:t>
+        <w:t xml:space="preserve"> - implements </w:t>
       </w:r>
       <w:r>
         <w:rPr>
@@ -1426,7 +1402,7 @@
       <w:pPr>
         <w:numPr>
           <w:ilvl w:val="0"/>
-          <w:numId w:val="6"/>
+          <w:numId w:val="7"/>
         </w:numPr>
         <w:spacing w:after="0" w:afterAutospacing="0" w:lineRule="auto"/>
         <w:ind w:left="720" w:hanging="360"/>
@@ -1442,7 +1418,7 @@
         <w:rPr>
           <w:rtl w:val="0"/>
         </w:rPr>
-        <w:t xml:space="preserve"> – runs one engine call on a background thread and returns the result on the JavaFX thread; every button handler that used to call the engine directly now goes through it, since the call is a network request now.</w:t>
+        <w:t xml:space="preserve"> - runs one engine call on a background thread and returns the result on the JavaFX thread; every button handler that used to call the engine directly now goes through it, since the call is a network request now.</w:t>
         <w:br w:type="textWrapping"/>
       </w:r>
     </w:p>
@@ -1450,7 +1426,7 @@
       <w:pPr>
         <w:numPr>
           <w:ilvl w:val="0"/>
-          <w:numId w:val="6"/>
+          <w:numId w:val="7"/>
         </w:numPr>
         <w:spacing w:after="0" w:afterAutospacing="0" w:lineRule="auto"/>
         <w:ind w:left="720" w:hanging="360"/>
@@ -1479,7 +1455,7 @@
         <w:rPr>
           <w:rtl w:val="0"/>
         </w:rPr>
-        <w:t xml:space="preserve"> – new. </w:t>
+        <w:t xml:space="preserve"> - new. </w:t>
       </w:r>
       <w:r>
         <w:rPr>
@@ -1500,37 +1476,22 @@
       <w:pPr>
         <w:numPr>
           <w:ilvl w:val="0"/>
-          <w:numId w:val="6"/>
-        </w:numPr>
-        <w:spacing w:after="240" w:lineRule="auto"/>
-        <w:ind w:left="720" w:hanging="360"/>
-      </w:pPr>
-      <w:r>
-        <w:rPr>
-          <w:color w:val="188038"/>
-          <w:rtl w:val="0"/>
-        </w:rPr>
-        <w:t xml:space="preserve">UsersScreen</w:t>
-      </w:r>
-      <w:r>
-        <w:rPr>
-          <w:rtl w:val="0"/>
-        </w:rPr>
-        <w:t xml:space="preserve"> gained a </w:t>
-      </w:r>
-      <w:r>
-        <w:rPr>
-          <w:b w:val="1"/>
-          <w:bCs w:val="1"/>
-          <w:rtl w:val="0"/>
-        </w:rPr>
-        <w:t xml:space="preserve">Load funds</w:t>
-      </w:r>
-      <w:r>
-        <w:rPr>
-          <w:rtl w:val="0"/>
-        </w:rPr>
-        <w:t xml:space="preserve"> action on your own account, since Exercise 3 dropped the XML-driven starting balance.</w:t>
+          <w:numId w:val="7"/>
+        </w:numPr>
+        <w:spacing w:after="40" w:before="0" w:beforeAutospacing="0" w:lineRule="auto"/>
+        <w:ind w:left="720" w:right="600" w:hanging="360"/>
+        <w:rPr/>
+      </w:pPr>
+      <w:r>
+        <w:rPr>
+          <w:rtl w:val="0"/>
+        </w:rPr>
+        <w:t xml:space="preserve">UsersScreen gained a Load funds action and a per-transaction account history table (reason, amount, balance after) on your own account, since Exercise 3 dropped the XML-driven starting balance and requires every account change shown in its own row. Selecting another user now shows only their name, balance, and market-maker flag - the assignment reserves participations and transaction history for your own account.</w:t>
+      </w:r>
+      <w:r>
+        <w:rPr>
+          <w:rtl w:val="0"/>
+        </w:rPr>
         <w:br w:type="textWrapping"/>
       </w:r>
     </w:p>
@@ -1796,7 +1757,7 @@
         <w:rPr>
           <w:rtl w:val="0"/>
         </w:rPr>
-        <w:t xml:space="preserve">New users start at balance 0. The Exercise 3 schema dropped GM-users/initial-cash entirely, and Exercise 3 separately adds a “load funds” action that didn’t exist before – we read that as the intended replacement, so everyone starts at 0 and funds themselves.</w:t>
+        <w:t xml:space="preserve">New users start at balance 0. The Exercise 3 schema dropped GM-users/initial-cash entirely, and Exercise 3 separately adds a “load funds” action that didn’t exist before - we read that as the intended replacement, so everyone starts at 0 and funds themselves.</w:t>
         <w:br w:type="textWrapping"/>
       </w:r>
     </w:p>
@@ -1813,7 +1774,7 @@
         <w:rPr>
           <w:rtl w:val="0"/>
         </w:rPr>
-        <w:t xml:space="preserve">Deposits work even on a blocked account. The base assignment blocks all actions once an account goes negative, but that predates deposits existing at all – with no other way to recover, we let deposits through regardless and keep the block on every trading action.</w:t>
+        <w:t xml:space="preserve">Deposits work even on a blocked account. The base assignment blocks all actions once an account goes negative, but that predates deposits existing at all - with no other way to recover, we let deposits through regardless and keep the block on every trading action.</w:t>
         <w:br w:type="textWrapping"/>
       </w:r>
     </w:p>
@@ -1864,7 +1825,7 @@
         <w:rPr>
           <w:rtl w:val="0"/>
         </w:rPr>
-        <w:t xml:space="preserve">The whole engine is one synchronized lock. The trading logic inherited from Exercise 1/2 was never written to be thread-safe, and Tomcat serves requests on multiple threads – a single lock is the simplest correct fix at this exercise’s scale.</w:t>
+        <w:t xml:space="preserve">The whole engine is one synchronized lock. The trading logic inherited from Exercise 1/2 was never written to be thread-safe, and Tomcat serves requests on multiple threads - a single lock is the simplest correct fix at this exercise’s scale.</w:t>
         <w:br w:type="textWrapping"/>
       </w:r>
     </w:p>
@@ -1898,7 +1859,7 @@
         <w:rPr>
           <w:rtl w:val="0"/>
         </w:rPr>
-        <w:t xml:space="preserve">Nothing persists past a server restart – users, events, trades, chat, all gone, exactly as described.</w:t>
+        <w:t xml:space="preserve">Nothing persists past a server restart - users, events, trades, chat, all gone, exactly as described.</w:t>
         <w:br w:type="textWrapping"/>
       </w:r>
     </w:p>
@@ -1939,7 +1900,7 @@
         <w:rPr>
           <w:rtl w:val="0"/>
         </w:rPr>
-        <w:t xml:space="preserve"> is applied client-side – it only exposes matching predicates, not its criteria, so </w:t>
+        <w:t xml:space="preserve"> is applied client-side - it only exposes matching predicates, not its criteria, so </w:t>
       </w:r>
       <w:r>
         <w:rPr>
@@ -2008,7 +1969,7 @@
         <w:rPr>
           <w:rtl w:val="0"/>
         </w:rPr>
-        <w:t xml:space="preserve"> already used – won’t deploy on an older Tomcat 9.</w:t>
+        <w:t xml:space="preserve"> already used - won’t deploy on an older Tomcat 9.</w:t>
         <w:br w:type="textWrapping"/>
       </w:r>
     </w:p>
@@ -2025,7 +1986,7 @@
         <w:rPr>
           <w:rtl w:val="0"/>
         </w:rPr>
-        <w:t xml:space="preserve">Everything else – LMSR/order-book math, commission handling, blocking rules – is unchanged from Exercise 2.</w:t>
+        <w:t xml:space="preserve">Everything else - LMSR/order-book math, commission handling, blocking rules - is unchanged from Exercise 2.</w:t>
         <w:br w:type="textWrapping"/>
       </w:r>
     </w:p>
@@ -2184,7 +2145,7 @@
         <w:rPr>
           <w:rtl w:val="0"/>
         </w:rPr>
-        <w:t xml:space="preserve"> class (not a test double) through the whole flow – login, deposit, upload, trade both event types, close, chat, duplicate rejection – against the live server.</w:t>
+        <w:t xml:space="preserve"> class (not a test double) through the whole flow – login, deposit, upload, trade both event types, close, chat, duplicate rejection - against the live server.</w:t>
         <w:br w:type="textWrapping"/>
       </w:r>
     </w:p>
@@ -2238,7 +2199,7 @@
         <w:rPr>
           <w:rtl w:val="0"/>
         </w:rPr>
-        <w:t xml:space="preserve"> runs all of this – unit tests, a real Tomcat deploy, and the packaged client launching – on </w:t>
+        <w:t xml:space="preserve"> runs all of this - unit tests, a real Tomcat deploy, and the packaged client launching - on </w:t>
       </w:r>
       <w:r>
         <w:rPr>
@@ -2754,7 +2715,9 @@
         <w:iCs w:val="0"/>
         <w:smallCaps w:val="0"/>
         <w:strike w:val="0"/>
-        <w:color w:val="000000"/>
+        <w:color w:val="cccccc"/>
+        <w:sz w:val="20"/>
+        <w:szCs w:val="20"/>
         <w:u w:val="none"/>
       </w:rPr>
     </w:lvl>

</xml_diff>